<commit_message>
feat(branding): rename platform to Certisphere and implement unified branding system
</commit_message>
<xml_diff>
--- a/QMS Studio.docx
+++ b/QMS Studio.docx
@@ -41,7 +41,7 @@
           <w:lang w:eastAsia="en-GB"/>
           <w14:ligatures w14:val="none"/>
         </w:rPr>
-        <w:t>QMS Studio™</w:t>
+        <w:t>Certisphere™</w:t>
       </w:r>
     </w:p>
     <w:p>
@@ -2069,7 +2069,6 @@
           <w:lang w:eastAsia="en-GB"/>
           <w14:ligatures w14:val="none"/>
         </w:rPr>
-        <w:lastRenderedPageBreak/>
         <w:t xml:space="preserve">    admin/</w:t>
       </w:r>
     </w:p>
@@ -8499,7 +8498,6 @@
           <w:lang w:eastAsia="en-GB"/>
           <w14:ligatures w14:val="none"/>
         </w:rPr>
-        <w:lastRenderedPageBreak/>
         <w:t xml:space="preserve">    developer-guides/</w:t>
       </w:r>
     </w:p>
@@ -12270,7 +12268,6 @@
           <w:lang w:eastAsia="en-GB"/>
           <w14:ligatures w14:val="none"/>
         </w:rPr>
-        <w:lastRenderedPageBreak/>
         <w:t xml:space="preserve">    regression/</w:t>
       </w:r>
     </w:p>
@@ -16194,7 +16191,6 @@
           <w:lang w:eastAsia="en-GB"/>
           <w14:ligatures w14:val="none"/>
         </w:rPr>
-        <w:lastRenderedPageBreak/>
         <w:t xml:space="preserve">        pdf/</w:t>
       </w:r>
     </w:p>
@@ -20195,7 +20191,6 @@
           <w:lang w:eastAsia="en-GB"/>
           <w14:ligatures w14:val="none"/>
         </w:rPr>
-        <w:lastRenderedPageBreak/>
         <w:t xml:space="preserve">    </w:t>
       </w:r>
       <w:proofErr w:type="spellStart"/>

</xml_diff>